<commit_message>
Add updated CVs and update PDF links
Add new 06-06-26 CV assets (both with and without projects in DOCX and PDF) and update an existing 05-26-26 DOCX binary. Update src/app/page.tsx to point the download link and embedded iframe to the new 06-06-26 'with projects' PDF.
</commit_message>
<xml_diff>
--- a/public/assets/CV/05-26-26/MJ VINZ CARLOS VILLARAIZ(with projects).docx
+++ b/public/assets/CV/05-26-26/MJ VINZ CARLOS VILLARAIZ(with projects).docx
@@ -1035,8 +1035,8 @@
           <w:szCs w:val="19"/>
         </w:rPr>
       </w:pPr>
-      <w:bookmarkStart w:id="1" w:name="_Hlk230090662"/>
-      <w:bookmarkStart w:id="2" w:name="_Hlk230090692"/>
+      <w:bookmarkStart w:id="1" w:name="_Hlk230090692"/>
+      <w:bookmarkStart w:id="2" w:name="_Hlk230090662"/>
       <w:r>
         <w:rPr>
           <w:b/>
@@ -1056,26 +1056,26 @@
         <w:t>(Capstone Project)</w:t>
       </w:r>
     </w:p>
+    <w:bookmarkEnd w:id="1"/>
+    <w:p>
+      <w:pPr>
+        <w:spacing w:line="276" w:lineRule="auto"/>
+        <w:rPr>
+          <w:color w:val="404040" w:themeColor="text1" w:themeTint="BF"/>
+          <w:sz w:val="19"/>
+          <w:szCs w:val="19"/>
+        </w:rPr>
+      </w:pPr>
+      <w:r>
+        <w:rPr>
+          <w:color w:val="404040" w:themeColor="text1" w:themeTint="BF"/>
+          <w:sz w:val="19"/>
+          <w:szCs w:val="19"/>
+        </w:rPr>
+        <w:t>An NLP-powered desktop application that analyzes and maps alignment between BSIT course outlines and industry technical competency requirements using Python, PyTorch, and HuggingFace Transformers, with data processing and visualization powered by Pandas and Matplotlib.</w:t>
+      </w:r>
+    </w:p>
     <w:bookmarkEnd w:id="2"/>
-    <w:p>
-      <w:pPr>
-        <w:spacing w:line="276" w:lineRule="auto"/>
-        <w:rPr>
-          <w:color w:val="404040" w:themeColor="text1" w:themeTint="BF"/>
-          <w:sz w:val="19"/>
-          <w:szCs w:val="19"/>
-        </w:rPr>
-      </w:pPr>
-      <w:r>
-        <w:rPr>
-          <w:color w:val="404040" w:themeColor="text1" w:themeTint="BF"/>
-          <w:sz w:val="19"/>
-          <w:szCs w:val="19"/>
-        </w:rPr>
-        <w:t>An NLP-powered desktop application that analyzes and maps alignment between BSIT course outlines and industry technical competency requirements using Python, PyTorch, and HuggingFace Transformers, with data processing and visualization powered by Pandas and Matplotlib.</w:t>
-      </w:r>
-    </w:p>
-    <w:bookmarkEnd w:id="1"/>
     <w:p>
       <w:pPr>
         <w:spacing w:line="276" w:lineRule="auto"/>
@@ -2489,6 +2489,7 @@
   <w:style w:type="character" w:default="1" w:styleId="DefaultParagraphFont">
     <w:name w:val="Default Paragraph Font"/>
     <w:uiPriority w:val="1"/>
+    <w:semiHidden/>
     <w:unhideWhenUsed/>
   </w:style>
   <w:style w:type="table" w:default="1" w:styleId="TableNormal">

</xml_diff>